<commit_message>
Draft_093: clear residual DO-as-function wording around Figure 1
</commit_message>
<xml_diff>
--- a/thesis/003_ThesisProposal_Draft_093.docx
+++ b/thesis/003_ThesisProposal_Draft_093.docx
@@ -1080,7 +1080,7 @@
           <w:bCs w:val="0"/>
         </w:rPr>
         <w:t xml:space="preserve">
-        The only function labels in this study are Epistemic Caution (EC) and Politeness/Deference (P). False positives are not a function. They are a residual record of candidates that do not qualify as P or EC. EC and P may co-occur on one retained token (EC+P). Connectors and framing forms may appear in the Step 1 net. If they meet neither the P criterion nor the EC Working Test, they are recorded as FP (or left uncounted as hedges), not as a third function. The Working Test supports EC only. It is not applied to pure P tokens. It is not a license to count every soft-sounding word. Crompton (1997) informs only the EC diagnostic. A proposition restatable with greater author commitment signals reduced epistemic weight. Crompton argues that the term hedge is most useful when reserved for such epistemic provisionality on knowledge claims, rather than extended to politeness-related features such as passives, impersonal constructions, or emotion-projecting lexis as such. The present study does not adopt Crompton’s full taxonomy. It uses that argument to support the EC diagnostic on retained hedges, not as the sole candidate-tagging rule. The 100% EC profile of the retained set is therefore readable as both an empirical pattern in this sample and a product of the Step 2 rule that keeps only claim mitigation in the hedge tally. The zero for pure DO in that tally is expected under the same rule. The zero for P is the clearer empirical null in this abstract genre.
+        The only function labels in this study are Epistemic Caution (EC) and Politeness/Deference (P). False positives are not a function. They are a residual record of candidates that do not qualify as P or EC. EC and P may co-occur on one retained token (EC+P). Connectors and framing forms may appear in the Step 1 net. If they meet neither the P criterion nor the EC Working Test, they are recorded as FP (or left uncounted as hedges), not as a third function. The Working Test supports EC only. It is not applied to pure P tokens. It is not a license to count every soft-sounding word. Crompton (1997) informs only the EC diagnostic. A proposition restatable with greater author commitment signals reduced epistemic weight. Crompton argues that the term hedge is most useful when reserved for such epistemic provisionality on knowledge claims, rather than extended to politeness-related features such as passives, impersonal constructions, or emotion-projecting lexis as such. The present study does not adopt Crompton’s full taxonomy. It uses that argument to support the EC diagnostic on retained hedges, not as the sole candidate-tagging rule. The 100% EC profile of the retained set is therefore readable as both an empirical pattern in this sample and a product of the Step 2 rule that keeps only claim mitigation in the hedge tally. The zero for P is the clearer empirical null in this abstract genre. Non-qualifying candidates are FP records, not a third function.
     </w:t>
       </w:r>
     </w:p>
@@ -1102,7 +1102,7 @@
           <w:b w:val="0"/>
           <w:bCs w:val="0"/>
         </w:rPr>
-        <w:t>The conceptual framework is presented in Figure 1. The grouping variable is discipline (Agriculture, Veterinary Medicine, and Biology). The outcome measures are hedge type frequency, distribution, and function. Figure 1 shows the study’s type and function categories in that pipeline. The analytical path moves from Step 1 and Step 2 through frequency analysis and cross-disciplinary comparison to functional and interpretive reading. Source jobs are stated in the framework text: Hyland (1998) supplies the type instrument and the starting point for EC and P on retained hedges, Crompton (1997) supports the Step 3 EC diagnostic, Salager-Meyer (1994) is the Part IV claim-responsibility lens, and Hyland (2005) is the stance lens for implications. DO appears in Figure 1 as a possible function label and logging category in this scheme. It is not treated as one of Hyland’s hedge functions. Two boundary conditions are acknowledged throughout. The texts are produced by developing researchers whose work may not yet reflect discipline-specific norms. The institutional context at PSAU includes L2 English use, but language proficiency is not measured as a variable in this design. These factors bound how far the findings may be generalized.</w:t>
+        <w:t>The conceptual framework is presented in Figure 1. The grouping variable is discipline (Agriculture, Veterinary Medicine, and Biology). The outcome measures are hedge type frequency, distribution, and function. Figure 1 shows the study’s type and function categories in that pipeline. The analytical path moves from Step 1 and Step 2 through frequency analysis and cross-disciplinary comparison to functional and interpretive reading. Source jobs are stated in the framework text: Hyland (1998) supplies the type instrument and the starting point for EC and P on retained hedges, Crompton (1997) supports the Step 2b EC Working Test, Salager-Meyer (1994) is the Part IV claim-responsibility lens, and Hyland (2005) is the stance lens for implications. DO appears in Figure 1 as a possible function label and logging category in this scheme. It is not treated as one of Hyland’s hedge functions. Two boundary conditions are acknowledged throughout. The texts are produced by developing researchers whose work may not yet reflect discipline-specific norms. The institutional context at PSAU includes L2 English use, but language proficiency is not measured as a variable in this design. These factors bound how far the findings may be generalized.</w:t>
       </w:r>
       <w:r>
         <w:rPr>

</xml_diff>

<commit_message>
Draft_093: Figure 1 DO function wording → placeholder note
</commit_message>
<xml_diff>
--- a/thesis/003_ThesisProposal_Draft_093.docx
+++ b/thesis/003_ThesisProposal_Draft_093.docx
@@ -1102,7 +1102,9 @@
           <w:b w:val="0"/>
           <w:bCs w:val="0"/>
         </w:rPr>
-        <w:t>The conceptual framework is presented in Figure 1. The grouping variable is discipline (Agriculture, Veterinary Medicine, and Biology). The outcome measures are hedge type frequency, distribution, and function. Figure 1 shows the study’s type and function categories in that pipeline. The analytical path moves from Step 1 and Step 2 through frequency analysis and cross-disciplinary comparison to functional and interpretive reading. Source jobs are stated in the framework text: Hyland (1998) supplies the type instrument and the starting point for EC and P on retained hedges, Crompton (1997) supports the Step 2b EC Working Test, Salager-Meyer (1994) is the Part IV claim-responsibility lens, and Hyland (2005) is the stance lens for implications. DO appears in Figure 1 as a possible function label and logging category in this scheme. It is not treated as one of Hyland’s hedge functions. Two boundary conditions are acknowledged throughout. The texts are produced by developing researchers whose work may not yet reflect discipline-specific norms. The institutional context at PSAU includes L2 English use, but language proficiency is not measured as a variable in this design. These factors bound how far the findings may be generalized.</w:t>
+        <w:t xml:space="preserve">
+        The conceptual framework is presented in Figure 1. The grouping variable is discipline (Agriculture, Veterinary Medicine, and Biology). The outcome measures are hedge type frequency, distribution, and function. Figure 1 shows the study’s type and function categories in that pipeline. The analytical path moves from Step 1 and Step 2 through frequency analysis and cross-disciplinary comparison to functional and interpretive reading. Source jobs are stated in the framework text: Hyland (1998) supplies the type instrument and the starting point for EC and P on retained hedges, Crompton (1997) supports the Step 2b EC Working Test, Salager-Meyer (1994) is the Part IV claim-responsibility lens, and Hyland (2005) is the stance lens for implications. Figure 1 is retained as a placeholder overview figure and will be redrawn later to match the P/EC-only function scheme (FP as reject record, not a function). Two boundary conditions are acknowledged throughout. The texts are produced by developing researchers whose work may not yet reflect discipline-specific norms. The institutional context at PSAU includes L2 English use, but language proficiency is not measured as a variable in this design. These factors bound how far the findings may be generalized.
+    </w:t>
       </w:r>
       <w:r>
         <w:rPr>

</xml_diff>